<commit_message>
Ajusta proposta para R$ 541.360,00
Reduz gestão de 12% para 10%, revisa horas-base considerando recursos
nativos de Django/Wagtail (2.978 h -> 2.695 h) e ajusta a operação
(hospedagem R$ 1.300, backup R$ 640, suporte 15 h/mês).

Co-Authored-By: Claude Opus 5.5 <noreply@anthropic.com>
Claude-Session: https://claude.ai/code/session_01W9k6rtJ9YG3B4ZzgCkiDqC
</commit_message>
<xml_diff>
--- a/docs/entregaveis/Observatorio_FBA_Proposta_Comercial_NatGED.docx
+++ b/docs/entregaveis/Observatorio_FBA_Proposta_Comercial_NatGED.docx
@@ -1196,7 +1196,7 @@
               <w:jc w:val="left"/>
             </w:pPr>
             <w:r>
-              <w:t xml:space="preserve">320 h</w:t>
+              <w:t xml:space="preserve">245 h</w:t>
             </w:r>
           </w:p>
         </w:tc>
@@ -1222,7 +1222,7 @@
               <w:jc w:val="left"/>
             </w:pPr>
             <w:r>
-              <w:t xml:space="preserve">450 h</w:t>
+              <w:t xml:space="preserve">420 h</w:t>
             </w:r>
           </w:p>
         </w:tc>
@@ -1248,7 +1248,7 @@
               <w:jc w:val="left"/>
             </w:pPr>
             <w:r>
-              <w:t xml:space="preserve">1.400 h</w:t>
+              <w:t xml:space="preserve">1.270 h</w:t>
             </w:r>
           </w:p>
         </w:tc>
@@ -1274,7 +1274,7 @@
               <w:jc w:val="left"/>
             </w:pPr>
             <w:r>
-              <w:t xml:space="preserve">350 h</w:t>
+              <w:t xml:space="preserve">300 h</w:t>
             </w:r>
           </w:p>
         </w:tc>
@@ -1300,7 +1300,7 @@
               <w:jc w:val="left"/>
             </w:pPr>
             <w:r>
-              <w:t xml:space="preserve">300 h</w:t>
+              <w:t xml:space="preserve">290 h</w:t>
             </w:r>
           </w:p>
         </w:tc>
@@ -1326,7 +1326,7 @@
               <w:jc w:val="left"/>
             </w:pPr>
             <w:r>
-              <w:t xml:space="preserve">158 h</w:t>
+              <w:t xml:space="preserve">170 h</w:t>
             </w:r>
           </w:p>
         </w:tc>
@@ -1360,7 +1360,7 @@
                 <w:bCs/>
                 <w:b/>
               </w:rPr>
-              <w:t xml:space="preserve">2.978 h</w:t>
+              <w:t xml:space="preserve">2.695 h</w:t>
             </w:r>
           </w:p>
         </w:tc>
@@ -1434,6 +1434,28 @@
       </w:r>
       <w:r>
         <w:t xml:space="preserve">para todos os perfis.</w:t>
+      </w:r>
+    </w:p>
+    <w:p>
+      <w:pPr>
+        <w:numPr>
+          <w:ilvl w:val="0"/>
+          <w:numId w:val="1001"/>
+        </w:numPr>
+        <w:pStyle w:val="Compact"/>
+      </w:pPr>
+      <w:r>
+        <w:rPr>
+          <w:bCs/>
+          <w:b/>
+        </w:rPr>
+        <w:t xml:space="preserve">Produtividade:</w:t>
+      </w:r>
+      <w:r>
+        <w:t xml:space="preserve"> </w:t>
+      </w:r>
+      <w:r>
+        <w:t xml:space="preserve">as estimativas consideram o uso de recursos nativos do Django e do Wagtail (painel administrativo, CMS, permissões, versionamento e auditoria) e de bibliotecas prontas para formulários, mapas e gráficos. Isso reduz o esforço de desenvolvimento sem reduzir o escopo.</w:t>
       </w:r>
     </w:p>
     <w:p>
@@ -1588,19 +1610,19 @@
               <w:jc w:val="right"/>
             </w:pPr>
             <w:r>
-              <w:t xml:space="preserve">134</w:t>
-            </w:r>
-          </w:p>
-        </w:tc>
-        <w:tc>
-          <w:tcPr/>
-          <w:p>
-            <w:pPr>
-              <w:pStyle w:val="Compact"/>
-              <w:jc w:val="right"/>
-            </w:pPr>
-            <w:r>
-              <w:t xml:space="preserve">21.440,00</w:t>
+              <w:t xml:space="preserve">132</w:t>
+            </w:r>
+          </w:p>
+        </w:tc>
+        <w:tc>
+          <w:tcPr/>
+          <w:p>
+            <w:pPr>
+              <w:pStyle w:val="Compact"/>
+              <w:jc w:val="right"/>
+            </w:pPr>
+            <w:r>
+              <w:t xml:space="preserve">21.120,00</w:t>
             </w:r>
           </w:p>
         </w:tc>
@@ -1638,19 +1660,19 @@
               <w:jc w:val="right"/>
             </w:pPr>
             <w:r>
-              <w:t xml:space="preserve">269</w:t>
-            </w:r>
-          </w:p>
-        </w:tc>
-        <w:tc>
-          <w:tcPr/>
-          <w:p>
-            <w:pPr>
-              <w:pStyle w:val="Compact"/>
-              <w:jc w:val="right"/>
-            </w:pPr>
-            <w:r>
-              <w:t xml:space="preserve">43.040,00</w:t>
+              <w:t xml:space="preserve">220</w:t>
+            </w:r>
+          </w:p>
+        </w:tc>
+        <w:tc>
+          <w:tcPr/>
+          <w:p>
+            <w:pPr>
+              <w:pStyle w:val="Compact"/>
+              <w:jc w:val="right"/>
+            </w:pPr>
+            <w:r>
+              <w:t xml:space="preserve">35.200,00</w:t>
             </w:r>
           </w:p>
         </w:tc>
@@ -1688,19 +1710,19 @@
               <w:jc w:val="right"/>
             </w:pPr>
             <w:r>
-              <w:t xml:space="preserve">224</w:t>
-            </w:r>
-          </w:p>
-        </w:tc>
-        <w:tc>
-          <w:tcPr/>
-          <w:p>
-            <w:pPr>
-              <w:pStyle w:val="Compact"/>
-              <w:jc w:val="right"/>
-            </w:pPr>
-            <w:r>
-              <w:t xml:space="preserve">35.840,00</w:t>
+              <w:t xml:space="preserve">198</w:t>
+            </w:r>
+          </w:p>
+        </w:tc>
+        <w:tc>
+          <w:tcPr/>
+          <w:p>
+            <w:pPr>
+              <w:pStyle w:val="Compact"/>
+              <w:jc w:val="right"/>
+            </w:pPr>
+            <w:r>
+              <w:t xml:space="preserve">31.680,00</w:t>
             </w:r>
           </w:p>
         </w:tc>
@@ -1738,19 +1760,19 @@
               <w:jc w:val="right"/>
             </w:pPr>
             <w:r>
-              <w:t xml:space="preserve">246</w:t>
-            </w:r>
-          </w:p>
-        </w:tc>
-        <w:tc>
-          <w:tcPr/>
-          <w:p>
-            <w:pPr>
-              <w:pStyle w:val="Compact"/>
-              <w:jc w:val="right"/>
-            </w:pPr>
-            <w:r>
-              <w:t xml:space="preserve">39.360,00</w:t>
+              <w:t xml:space="preserve">231</w:t>
+            </w:r>
+          </w:p>
+        </w:tc>
+        <w:tc>
+          <w:tcPr/>
+          <w:p>
+            <w:pPr>
+              <w:pStyle w:val="Compact"/>
+              <w:jc w:val="right"/>
+            </w:pPr>
+            <w:r>
+              <w:t xml:space="preserve">36.960,00</w:t>
             </w:r>
           </w:p>
         </w:tc>
@@ -1788,19 +1810,19 @@
               <w:jc w:val="right"/>
             </w:pPr>
             <w:r>
-              <w:t xml:space="preserve">246</w:t>
-            </w:r>
-          </w:p>
-        </w:tc>
-        <w:tc>
-          <w:tcPr/>
-          <w:p>
-            <w:pPr>
-              <w:pStyle w:val="Compact"/>
-              <w:jc w:val="right"/>
-            </w:pPr>
-            <w:r>
-              <w:t xml:space="preserve">39.360,00</w:t>
+              <w:t xml:space="preserve">231</w:t>
+            </w:r>
+          </w:p>
+        </w:tc>
+        <w:tc>
+          <w:tcPr/>
+          <w:p>
+            <w:pPr>
+              <w:pStyle w:val="Compact"/>
+              <w:jc w:val="right"/>
+            </w:pPr>
+            <w:r>
+              <w:t xml:space="preserve">36.960,00</w:t>
             </w:r>
           </w:p>
         </w:tc>
@@ -1838,19 +1860,19 @@
               <w:jc w:val="right"/>
             </w:pPr>
             <w:r>
-              <w:t xml:space="preserve">90</w:t>
-            </w:r>
-          </w:p>
-        </w:tc>
-        <w:tc>
-          <w:tcPr/>
-          <w:p>
-            <w:pPr>
-              <w:pStyle w:val="Compact"/>
-              <w:jc w:val="right"/>
-            </w:pPr>
-            <w:r>
-              <w:t xml:space="preserve">14.400,00</w:t>
+              <w:t xml:space="preserve">88</w:t>
+            </w:r>
+          </w:p>
+        </w:tc>
+        <w:tc>
+          <w:tcPr/>
+          <w:p>
+            <w:pPr>
+              <w:pStyle w:val="Compact"/>
+              <w:jc w:val="right"/>
+            </w:pPr>
+            <w:r>
+              <w:t xml:space="preserve">14.080,00</w:t>
             </w:r>
           </w:p>
         </w:tc>
@@ -1888,19 +1910,19 @@
               <w:jc w:val="right"/>
             </w:pPr>
             <w:r>
-              <w:t xml:space="preserve">224</w:t>
-            </w:r>
-          </w:p>
-        </w:tc>
-        <w:tc>
-          <w:tcPr/>
-          <w:p>
-            <w:pPr>
-              <w:pStyle w:val="Compact"/>
-              <w:jc w:val="right"/>
-            </w:pPr>
-            <w:r>
-              <w:t xml:space="preserve">35.840,00</w:t>
+              <w:t xml:space="preserve">198</w:t>
+            </w:r>
+          </w:p>
+        </w:tc>
+        <w:tc>
+          <w:tcPr/>
+          <w:p>
+            <w:pPr>
+              <w:pStyle w:val="Compact"/>
+              <w:jc w:val="right"/>
+            </w:pPr>
+            <w:r>
+              <w:t xml:space="preserve">31.680,00</w:t>
             </w:r>
           </w:p>
         </w:tc>
@@ -1938,19 +1960,19 @@
               <w:jc w:val="right"/>
             </w:pPr>
             <w:r>
-              <w:t xml:space="preserve">67</w:t>
-            </w:r>
-          </w:p>
-        </w:tc>
-        <w:tc>
-          <w:tcPr/>
-          <w:p>
-            <w:pPr>
-              <w:pStyle w:val="Compact"/>
-              <w:jc w:val="right"/>
-            </w:pPr>
-            <w:r>
-              <w:t xml:space="preserve">10.720,00</w:t>
+              <w:t xml:space="preserve">66</w:t>
+            </w:r>
+          </w:p>
+        </w:tc>
+        <w:tc>
+          <w:tcPr/>
+          <w:p>
+            <w:pPr>
+              <w:pStyle w:val="Compact"/>
+              <w:jc w:val="right"/>
+            </w:pPr>
+            <w:r>
+              <w:t xml:space="preserve">10.560,00</w:t>
             </w:r>
           </w:p>
         </w:tc>
@@ -1988,19 +2010,19 @@
               <w:jc w:val="right"/>
             </w:pPr>
             <w:r>
-              <w:t xml:space="preserve">112</w:t>
-            </w:r>
-          </w:p>
-        </w:tc>
-        <w:tc>
-          <w:tcPr/>
-          <w:p>
-            <w:pPr>
-              <w:pStyle w:val="Compact"/>
-              <w:jc w:val="right"/>
-            </w:pPr>
-            <w:r>
-              <w:t xml:space="preserve">17.920,00</w:t>
+              <w:t xml:space="preserve">110</w:t>
+            </w:r>
+          </w:p>
+        </w:tc>
+        <w:tc>
+          <w:tcPr/>
+          <w:p>
+            <w:pPr>
+              <w:pStyle w:val="Compact"/>
+              <w:jc w:val="right"/>
+            </w:pPr>
+            <w:r>
+              <w:t xml:space="preserve">17.600,00</w:t>
             </w:r>
           </w:p>
         </w:tc>
@@ -2038,19 +2060,19 @@
               <w:jc w:val="right"/>
             </w:pPr>
             <w:r>
-              <w:t xml:space="preserve">224</w:t>
-            </w:r>
-          </w:p>
-        </w:tc>
-        <w:tc>
-          <w:tcPr/>
-          <w:p>
-            <w:pPr>
-              <w:pStyle w:val="Compact"/>
-              <w:jc w:val="right"/>
-            </w:pPr>
-            <w:r>
-              <w:t xml:space="preserve">35.840,00</w:t>
+              <w:t xml:space="preserve">198</w:t>
+            </w:r>
+          </w:p>
+        </w:tc>
+        <w:tc>
+          <w:tcPr/>
+          <w:p>
+            <w:pPr>
+              <w:pStyle w:val="Compact"/>
+              <w:jc w:val="right"/>
+            </w:pPr>
+            <w:r>
+              <w:t xml:space="preserve">31.680,00</w:t>
             </w:r>
           </w:p>
         </w:tc>
@@ -2088,19 +2110,19 @@
               <w:jc w:val="right"/>
             </w:pPr>
             <w:r>
-              <w:t xml:space="preserve">179</w:t>
-            </w:r>
-          </w:p>
-        </w:tc>
-        <w:tc>
-          <w:tcPr/>
-          <w:p>
-            <w:pPr>
-              <w:pStyle w:val="Compact"/>
-              <w:jc w:val="right"/>
-            </w:pPr>
-            <w:r>
-              <w:t xml:space="preserve">28.640,00</w:t>
+              <w:t xml:space="preserve">154</w:t>
+            </w:r>
+          </w:p>
+        </w:tc>
+        <w:tc>
+          <w:tcPr/>
+          <w:p>
+            <w:pPr>
+              <w:pStyle w:val="Compact"/>
+              <w:jc w:val="right"/>
+            </w:pPr>
+            <w:r>
+              <w:t xml:space="preserve">24.640,00</w:t>
             </w:r>
           </w:p>
         </w:tc>
@@ -2138,19 +2160,19 @@
               <w:jc w:val="right"/>
             </w:pPr>
             <w:r>
-              <w:t xml:space="preserve">269</w:t>
-            </w:r>
-          </w:p>
-        </w:tc>
-        <w:tc>
-          <w:tcPr/>
-          <w:p>
-            <w:pPr>
-              <w:pStyle w:val="Compact"/>
-              <w:jc w:val="right"/>
-            </w:pPr>
-            <w:r>
-              <w:t xml:space="preserve">43.040,00</w:t>
+              <w:t xml:space="preserve">220</w:t>
+            </w:r>
+          </w:p>
+        </w:tc>
+        <w:tc>
+          <w:tcPr/>
+          <w:p>
+            <w:pPr>
+              <w:pStyle w:val="Compact"/>
+              <w:jc w:val="right"/>
+            </w:pPr>
+            <w:r>
+              <w:t xml:space="preserve">35.200,00</w:t>
             </w:r>
           </w:p>
         </w:tc>
@@ -2188,19 +2210,19 @@
               <w:jc w:val="right"/>
             </w:pPr>
             <w:r>
-              <w:t xml:space="preserve">157</w:t>
-            </w:r>
-          </w:p>
-        </w:tc>
-        <w:tc>
-          <w:tcPr/>
-          <w:p>
-            <w:pPr>
-              <w:pStyle w:val="Compact"/>
-              <w:jc w:val="right"/>
-            </w:pPr>
-            <w:r>
-              <w:t xml:space="preserve">25.120,00</w:t>
+              <w:t xml:space="preserve">154</w:t>
+            </w:r>
+          </w:p>
+        </w:tc>
+        <w:tc>
+          <w:tcPr/>
+          <w:p>
+            <w:pPr>
+              <w:pStyle w:val="Compact"/>
+              <w:jc w:val="right"/>
+            </w:pPr>
+            <w:r>
+              <w:t xml:space="preserve">24.640,00</w:t>
             </w:r>
           </w:p>
         </w:tc>
@@ -2238,19 +2260,19 @@
               <w:jc w:val="right"/>
             </w:pPr>
             <w:r>
-              <w:t xml:space="preserve">112</w:t>
-            </w:r>
-          </w:p>
-        </w:tc>
-        <w:tc>
-          <w:tcPr/>
-          <w:p>
-            <w:pPr>
-              <w:pStyle w:val="Compact"/>
-              <w:jc w:val="right"/>
-            </w:pPr>
-            <w:r>
-              <w:t xml:space="preserve">17.920,00</w:t>
+              <w:t xml:space="preserve">110</w:t>
+            </w:r>
+          </w:p>
+        </w:tc>
+        <w:tc>
+          <w:tcPr/>
+          <w:p>
+            <w:pPr>
+              <w:pStyle w:val="Compact"/>
+              <w:jc w:val="right"/>
+            </w:pPr>
+            <w:r>
+              <w:t xml:space="preserve">17.600,00</w:t>
             </w:r>
           </w:p>
         </w:tc>
@@ -2288,19 +2310,19 @@
               <w:jc w:val="right"/>
             </w:pPr>
             <w:r>
-              <w:t xml:space="preserve">224</w:t>
-            </w:r>
-          </w:p>
-        </w:tc>
-        <w:tc>
-          <w:tcPr/>
-          <w:p>
-            <w:pPr>
-              <w:pStyle w:val="Compact"/>
-              <w:jc w:val="right"/>
-            </w:pPr>
-            <w:r>
-              <w:t xml:space="preserve">35.840,00</w:t>
+              <w:t xml:space="preserve">198</w:t>
+            </w:r>
+          </w:p>
+        </w:tc>
+        <w:tc>
+          <w:tcPr/>
+          <w:p>
+            <w:pPr>
+              <w:pStyle w:val="Compact"/>
+              <w:jc w:val="right"/>
+            </w:pPr>
+            <w:r>
+              <w:t xml:space="preserve">31.680,00</w:t>
             </w:r>
           </w:p>
         </w:tc>
@@ -2338,19 +2360,19 @@
               <w:jc w:val="right"/>
             </w:pPr>
             <w:r>
-              <w:t xml:space="preserve">134</w:t>
-            </w:r>
-          </w:p>
-        </w:tc>
-        <w:tc>
-          <w:tcPr/>
-          <w:p>
-            <w:pPr>
-              <w:pStyle w:val="Compact"/>
-              <w:jc w:val="right"/>
-            </w:pPr>
-            <w:r>
-              <w:t xml:space="preserve">21.440,00</w:t>
+              <w:t xml:space="preserve">121</w:t>
+            </w:r>
+          </w:p>
+        </w:tc>
+        <w:tc>
+          <w:tcPr/>
+          <w:p>
+            <w:pPr>
+              <w:pStyle w:val="Compact"/>
+              <w:jc w:val="right"/>
+            </w:pPr>
+            <w:r>
+              <w:t xml:space="preserve">19.360,00</w:t>
             </w:r>
           </w:p>
         </w:tc>
@@ -2388,19 +2410,19 @@
               <w:jc w:val="right"/>
             </w:pPr>
             <w:r>
-              <w:t xml:space="preserve">67</w:t>
-            </w:r>
-          </w:p>
-        </w:tc>
-        <w:tc>
-          <w:tcPr/>
-          <w:p>
-            <w:pPr>
-              <w:pStyle w:val="Compact"/>
-              <w:jc w:val="right"/>
-            </w:pPr>
-            <w:r>
-              <w:t xml:space="preserve">16.720,00</w:t>
+              <w:t xml:space="preserve">66</w:t>
+            </w:r>
+          </w:p>
+        </w:tc>
+        <w:tc>
+          <w:tcPr/>
+          <w:p>
+            <w:pPr>
+              <w:pStyle w:val="Compact"/>
+              <w:jc w:val="right"/>
+            </w:pPr>
+            <w:r>
+              <w:t xml:space="preserve">16.560,00</w:t>
             </w:r>
           </w:p>
         </w:tc>
@@ -2442,7 +2464,7 @@
                 <w:bCs/>
                 <w:b/>
               </w:rPr>
-              <w:t xml:space="preserve">2.978</w:t>
+              <w:t xml:space="preserve">2.695</w:t>
             </w:r>
           </w:p>
         </w:tc>
@@ -2458,7 +2480,7 @@
                 <w:bCs/>
                 <w:b/>
               </w:rPr>
-              <w:t xml:space="preserve">482.480,00</w:t>
+              <w:t xml:space="preserve">437.200,00</w:t>
             </w:r>
           </w:p>
         </w:tc>
@@ -2487,7 +2509,7 @@
         <w:t xml:space="preserve"> </w:t>
       </w:r>
       <w:r>
-        <w:t xml:space="preserve">⁴ 67 h (R$ 10.720,00) + R$ 6.000,00 de infraestrutura de homologação durante o desenvolvimento (6 meses).</w:t>
+        <w:t xml:space="preserve">⁴ 66 h (R$ 10.560,00) + R$ 6.000,00 de infraestrutura de homologação durante o desenvolvimento (6 meses).</w:t>
       </w:r>
     </w:p>
     <w:p>
@@ -2610,7 +2632,7 @@
               <w:jc w:val="right"/>
             </w:pPr>
             <w:r>
-              <w:t xml:space="preserve">1.500,00</w:t>
+              <w:t xml:space="preserve">1.300,00</w:t>
             </w:r>
           </w:p>
         </w:tc>
@@ -2634,7 +2656,7 @@
               <w:jc w:val="right"/>
             </w:pPr>
             <w:r>
-              <w:t xml:space="preserve">36.000,00</w:t>
+              <w:t xml:space="preserve">31.200,00</w:t>
             </w:r>
           </w:p>
         </w:tc>
@@ -2672,7 +2694,7 @@
               <w:jc w:val="right"/>
             </w:pPr>
             <w:r>
-              <w:t xml:space="preserve">800,00</w:t>
+              <w:t xml:space="preserve">640,00</w:t>
             </w:r>
           </w:p>
         </w:tc>
@@ -2696,7 +2718,7 @@
               <w:jc w:val="right"/>
             </w:pPr>
             <w:r>
-              <w:t xml:space="preserve">19.200,00</w:t>
+              <w:t xml:space="preserve">15.360,00</w:t>
             </w:r>
           </w:p>
         </w:tc>
@@ -2734,7 +2756,7 @@
               <w:jc w:val="right"/>
             </w:pPr>
             <w:r>
-              <w:t xml:space="preserve">3.200,00</w:t>
+              <w:t xml:space="preserve">2.400,00</w:t>
             </w:r>
           </w:p>
         </w:tc>
@@ -2758,7 +2780,7 @@
               <w:jc w:val="right"/>
             </w:pPr>
             <w:r>
-              <w:t xml:space="preserve">76.800,00</w:t>
+              <w:t xml:space="preserve">57.600,00</w:t>
             </w:r>
           </w:p>
         </w:tc>
@@ -2800,7 +2822,7 @@
                 <w:bCs/>
                 <w:b/>
               </w:rPr>
-              <w:t xml:space="preserve">5.500,00</w:t>
+              <w:t xml:space="preserve">4.340,00</w:t>
             </w:r>
           </w:p>
         </w:tc>
@@ -2824,7 +2846,7 @@
                 <w:bCs/>
                 <w:b/>
               </w:rPr>
-              <w:t xml:space="preserve">132.000,00</w:t>
+              <w:t xml:space="preserve">104.160,00</w:t>
             </w:r>
           </w:p>
         </w:tc>
@@ -2899,7 +2921,7 @@
               <w:jc w:val="right"/>
             </w:pPr>
             <w:r>
-              <w:t xml:space="preserve">482.480,00</w:t>
+              <w:t xml:space="preserve">437.200,00</w:t>
             </w:r>
           </w:p>
         </w:tc>
@@ -2925,7 +2947,7 @@
               <w:jc w:val="right"/>
             </w:pPr>
             <w:r>
-              <w:t xml:space="preserve">132.000,00</w:t>
+              <w:t xml:space="preserve">104.160,00</w:t>
             </w:r>
           </w:p>
         </w:tc>
@@ -2959,7 +2981,7 @@
                 <w:bCs/>
                 <w:b/>
               </w:rPr>
-              <w:t xml:space="preserve">614.480,00</w:t>
+              <w:t xml:space="preserve">541.360,00</w:t>
             </w:r>
           </w:p>
         </w:tc>
@@ -2974,13 +2996,13 @@
           <w:bCs/>
           <w:b/>
         </w:rPr>
-        <w:t xml:space="preserve">Valor total: R$ 614.480,00</w:t>
+        <w:t xml:space="preserve">Valor total: R$ 541.360,00</w:t>
       </w:r>
       <w:r>
         <w:t xml:space="preserve"> </w:t>
       </w:r>
       <w:r>
-        <w:t xml:space="preserve">(seiscentos e quatorze mil, quatrocentos e oitenta reais).</w:t>
+        <w:t xml:space="preserve">(quinhentos e quarenta e um mil, trezentos e sessenta reais).</w:t>
       </w:r>
     </w:p>
     <w:p>
@@ -3000,7 +3022,7 @@
           <w:bCs/>
           <w:b/>
         </w:rPr>
-        <w:t xml:space="preserve">Item 18 — Hospedagem cloud (R$ 1.500,00/mês)</w:t>
+        <w:t xml:space="preserve">Item 18 — Hospedagem cloud (R$ 1.300,00/mês)</w:t>
       </w:r>
     </w:p>
     <w:p>
@@ -3072,7 +3094,7 @@
           <w:bCs/>
           <w:b/>
         </w:rPr>
-        <w:t xml:space="preserve">Item 19 — Backup e segurança (R$ 800,00/mês)</w:t>
+        <w:t xml:space="preserve">Item 19 — Backup e segurança (R$ 640,00/mês)</w:t>
       </w:r>
     </w:p>
     <w:p>
@@ -3144,7 +3166,7 @@
         <w:pStyle w:val="Compact"/>
       </w:pPr>
       <w:r>
-        <w:t xml:space="preserve">Inclui 4 h/mês de atividades técnicas.</w:t>
+        <w:t xml:space="preserve">Inclui 3 h/mês de atividades técnicas.</w:t>
       </w:r>
     </w:p>
     <w:p>
@@ -3156,7 +3178,7 @@
           <w:bCs/>
           <w:b/>
         </w:rPr>
-        <w:t xml:space="preserve">Item 20 — Suporte e manutenção (R$ 3.200,00/mês)</w:t>
+        <w:t xml:space="preserve">Item 20 — Suporte e manutenção (R$ 2.400,00/mês)</w:t>
       </w:r>
     </w:p>
     <w:p>
@@ -3178,7 +3200,7 @@
           <w:bCs/>
           <w:b/>
         </w:rPr>
-        <w:t xml:space="preserve">20 h/mês</w:t>
+        <w:t xml:space="preserve">15 h/mês</w:t>
       </w:r>
       <w:r>
         <w:t xml:space="preserve"> </w:t>
@@ -4192,7 +4214,7 @@
               <w:jc w:val="left"/>
             </w:pPr>
             <w:r>
-              <w:t xml:space="preserve">Até R$ 1.300,00/mês</w:t>
+              <w:t xml:space="preserve">Até R$ 1.100,00/mês</w:t>
             </w:r>
           </w:p>
         </w:tc>
@@ -5783,7 +5805,7 @@
         <w:pStyle w:val="Heading3"/>
       </w:pPr>
       <w:r>
-        <w:t xml:space="preserve">10.1 Desenvolvimento e implantação (R$ 482.480,00), por marcos</w:t>
+        <w:t xml:space="preserve">10.1 Desenvolvimento e implantação (R$ 437.200,00), por marcos</w:t>
       </w:r>
     </w:p>
     <w:tbl>
@@ -5872,7 +5894,7 @@
               <w:jc w:val="right"/>
             </w:pPr>
             <w:r>
-              <w:t xml:space="preserve">48.248,00</w:t>
+              <w:t xml:space="preserve">43.720,00</w:t>
             </w:r>
           </w:p>
         </w:tc>
@@ -5910,7 +5932,7 @@
               <w:jc w:val="right"/>
             </w:pPr>
             <w:r>
-              <w:t xml:space="preserve">72.372,00</w:t>
+              <w:t xml:space="preserve">65.580,00</w:t>
             </w:r>
           </w:p>
         </w:tc>
@@ -5948,7 +5970,7 @@
               <w:jc w:val="right"/>
             </w:pPr>
             <w:r>
-              <w:t xml:space="preserve">96.496,00</w:t>
+              <w:t xml:space="preserve">87.440,00</w:t>
             </w:r>
           </w:p>
         </w:tc>
@@ -5986,7 +6008,7 @@
               <w:jc w:val="right"/>
             </w:pPr>
             <w:r>
-              <w:t xml:space="preserve">96.496,00</w:t>
+              <w:t xml:space="preserve">87.440,00</w:t>
             </w:r>
           </w:p>
         </w:tc>
@@ -6024,7 +6046,7 @@
               <w:jc w:val="right"/>
             </w:pPr>
             <w:r>
-              <w:t xml:space="preserve">96.496,00</w:t>
+              <w:t xml:space="preserve">87.440,00</w:t>
             </w:r>
           </w:p>
         </w:tc>
@@ -6062,7 +6084,7 @@
               <w:jc w:val="right"/>
             </w:pPr>
             <w:r>
-              <w:t xml:space="preserve">72.372,00</w:t>
+              <w:t xml:space="preserve">65.580,00</w:t>
             </w:r>
           </w:p>
         </w:tc>
@@ -6112,7 +6134,7 @@
                 <w:bCs/>
                 <w:b/>
               </w:rPr>
-              <w:t xml:space="preserve">482.480,00</w:t>
+              <w:t xml:space="preserve">437.200,00</w:t>
             </w:r>
           </w:p>
         </w:tc>
@@ -6141,7 +6163,7 @@
           <w:bCs/>
           <w:b/>
         </w:rPr>
-        <w:t xml:space="preserve">R$ 5.500,00</w:t>
+        <w:t xml:space="preserve">R$ 4.340,00</w:t>
       </w:r>
       <w:r>
         <w:t xml:space="preserve">, com faturamento mensal a partir do mês seguinte à implantação em produção.</w:t>
@@ -6431,7 +6453,7 @@
           <w:bCs/>
           <w:b/>
         </w:rPr>
-        <w:t xml:space="preserve">R$ 99.000,00</w:t>
+        <w:t xml:space="preserve">R$ 78.120,00</w:t>
       </w:r>
       <w:r>
         <w:t xml:space="preserve">.</w:t>
@@ -8088,7 +8110,7 @@
               <w:jc w:val="left"/>
             </w:pPr>
             <w:r>
-              <w:t xml:space="preserve">Desenvolvimento em 6 marcos (10/15/20/20/20/15%); operação mensal de R$ 5.500,00; pagamento em 15 dias da NF</w:t>
+              <w:t xml:space="preserve">Desenvolvimento em 6 marcos (10/15/20/20/20/15%); operação mensal de R$ 4.340,00; pagamento em 15 dias da NF</w:t>
             </w:r>
           </w:p>
         </w:tc>

</xml_diff>